<commit_message>
In class worksheet and P2 Interim Data analysis plans
</commit_message>
<xml_diff>
--- a/Project 2/Project 2 Interim Data Analysis Plan Description.docx
+++ b/Project 2/Project 2 Interim Data Analysis Plan Description.docx
@@ -9,7 +9,7 @@
         <w:spacing w:before="180" w:beforeAutospacing="0" w:after="180" w:afterAutospacing="0"/>
         <w:jc w:val="center"/>
         <w:rPr>
-          <w:rFonts w:asciiTheme="minorHAnsi" w:hAnsiTheme="minorHAnsi"/>
+          <w:rFonts w:ascii="Verdana" w:hAnsi="Verdana"/>
           <w:b/>
           <w:bCs/>
           <w:color w:val="273540"/>
@@ -19,7 +19,7 @@
       </w:pPr>
       <w:r>
         <w:rPr>
-          <w:rFonts w:asciiTheme="minorHAnsi" w:hAnsiTheme="minorHAnsi"/>
+          <w:rFonts w:ascii="Verdana" w:hAnsi="Verdana"/>
           <w:b/>
           <w:bCs/>
           <w:color w:val="273540"/>
@@ -35,7 +35,7 @@
         <w:shd w:val="clear" w:color="auto" w:fill="FFFFFF"/>
         <w:spacing w:before="180" w:beforeAutospacing="0" w:after="180" w:afterAutospacing="0"/>
         <w:rPr>
-          <w:rFonts w:asciiTheme="minorHAnsi" w:hAnsiTheme="minorHAnsi"/>
+          <w:rFonts w:ascii="Verdana" w:hAnsi="Verdana"/>
           <w:color w:val="273540"/>
           <w:sz w:val="22"/>
           <w:szCs w:val="22"/>
@@ -43,7 +43,7 @@
       </w:pPr>
       <w:r>
         <w:rPr>
-          <w:rFonts w:asciiTheme="minorHAnsi" w:hAnsiTheme="minorHAnsi"/>
+          <w:rFonts w:ascii="Verdana" w:hAnsi="Verdana"/>
           <w:color w:val="273540"/>
           <w:sz w:val="22"/>
           <w:szCs w:val="22"/>
@@ -57,7 +57,7 @@
         <w:shd w:val="clear" w:color="auto" w:fill="FFFFFF"/>
         <w:spacing w:before="180" w:beforeAutospacing="0" w:after="180" w:afterAutospacing="0"/>
         <w:rPr>
-          <w:rFonts w:asciiTheme="minorHAnsi" w:hAnsiTheme="minorHAnsi"/>
+          <w:rFonts w:ascii="Verdana" w:hAnsi="Verdana"/>
           <w:color w:val="273540"/>
           <w:sz w:val="22"/>
           <w:szCs w:val="22"/>
@@ -65,7 +65,7 @@
       </w:pPr>
       <w:r>
         <w:rPr>
-          <w:rFonts w:asciiTheme="minorHAnsi" w:hAnsiTheme="minorHAnsi"/>
+          <w:rFonts w:ascii="Verdana" w:hAnsi="Verdana"/>
           <w:color w:val="273540"/>
           <w:sz w:val="22"/>
           <w:szCs w:val="22"/>
@@ -79,7 +79,7 @@
         <w:shd w:val="clear" w:color="auto" w:fill="FFFFFF"/>
         <w:spacing w:before="180" w:beforeAutospacing="0" w:after="180" w:afterAutospacing="0"/>
         <w:rPr>
-          <w:rFonts w:asciiTheme="minorHAnsi" w:hAnsiTheme="minorHAnsi"/>
+          <w:rFonts w:ascii="Verdana" w:hAnsi="Verdana"/>
           <w:color w:val="273540"/>
           <w:sz w:val="22"/>
           <w:szCs w:val="22"/>
@@ -87,7 +87,7 @@
       </w:pPr>
       <w:r>
         <w:rPr>
-          <w:rFonts w:asciiTheme="minorHAnsi" w:hAnsiTheme="minorHAnsi"/>
+          <w:rFonts w:ascii="Verdana" w:hAnsi="Verdana"/>
           <w:color w:val="273540"/>
           <w:sz w:val="22"/>
           <w:szCs w:val="22"/>
@@ -103,12 +103,17 @@
           <w:numId w:val="1"/>
         </w:numPr>
         <w:spacing w:after="120"/>
-      </w:pPr>
-      <w:r>
-        <w:rPr>
-          <w:rFonts w:ascii="Arial" w:eastAsia="Arial" w:hAnsi="Arial" w:cs="Arial"/>
-          <w:sz w:val="20"/>
-          <w:szCs w:val="20"/>
+        <w:rPr>
+          <w:rFonts w:ascii="Verdana" w:hAnsi="Verdana"/>
+          <w:sz w:val="22"/>
+          <w:szCs w:val="22"/>
+        </w:rPr>
+      </w:pPr>
+      <w:r>
+        <w:rPr>
+          <w:rFonts w:ascii="Verdana" w:eastAsia="Arial" w:hAnsi="Verdana" w:cs="Arial"/>
+          <w:sz w:val="22"/>
+          <w:szCs w:val="22"/>
         </w:rPr>
         <w:t>Hypothesis 1a: Higher baseline cytokine and chemokine levels in circulating plasma will predict greater declines in episodic memory consolidation and decreases in AD-signature cortical thickness over a one-year follow-up period.</w:t>
       </w:r>
@@ -121,12 +126,17 @@
           <w:numId w:val="1"/>
         </w:numPr>
         <w:spacing w:after="120"/>
-      </w:pPr>
-      <w:r>
-        <w:rPr>
-          <w:rFonts w:ascii="Arial" w:eastAsia="Arial" w:hAnsi="Arial" w:cs="Arial"/>
-          <w:sz w:val="20"/>
-          <w:szCs w:val="20"/>
+        <w:rPr>
+          <w:rFonts w:ascii="Verdana" w:hAnsi="Verdana"/>
+          <w:sz w:val="22"/>
+          <w:szCs w:val="22"/>
+        </w:rPr>
+      </w:pPr>
+      <w:r>
+        <w:rPr>
+          <w:rFonts w:ascii="Verdana" w:eastAsia="Arial" w:hAnsi="Verdana" w:cs="Arial"/>
+          <w:sz w:val="22"/>
+          <w:szCs w:val="22"/>
         </w:rPr>
         <w:t>Hypothesis 1b: Greater increases in cytokine and chemokine levels from baseline to one-year follow-up will be associated with greater declines in episodic memory performance and AD-signature cortical thickness over the same period.</w:t>
       </w:r>
@@ -139,12 +149,17 @@
           <w:numId w:val="1"/>
         </w:numPr>
         <w:spacing w:after="120"/>
-      </w:pPr>
-      <w:r>
-        <w:rPr>
-          <w:rFonts w:ascii="Arial" w:eastAsia="Arial" w:hAnsi="Arial" w:cs="Arial"/>
-          <w:sz w:val="20"/>
-          <w:szCs w:val="20"/>
+        <w:rPr>
+          <w:rFonts w:ascii="Verdana" w:hAnsi="Verdana"/>
+          <w:sz w:val="22"/>
+          <w:szCs w:val="22"/>
+        </w:rPr>
+      </w:pPr>
+      <w:r>
+        <w:rPr>
+          <w:rFonts w:ascii="Verdana" w:eastAsia="Arial" w:hAnsi="Verdana" w:cs="Arial"/>
+          <w:sz w:val="22"/>
+          <w:szCs w:val="22"/>
         </w:rPr>
         <w:t xml:space="preserve">Primary outcomes are: </w:t>
       </w:r>
@@ -157,14 +172,27 @@
           <w:numId w:val="1"/>
         </w:numPr>
         <w:spacing w:after="120"/>
-      </w:pPr>
-      <w:r>
-        <w:rPr>
-          <w:rFonts w:ascii="Arial" w:eastAsia="Arial" w:hAnsi="Arial" w:cs="Arial"/>
-          <w:sz w:val="20"/>
-          <w:szCs w:val="20"/>
-        </w:rPr>
-        <w:t>(1) change in episodic memory performance, operationalized as change score from baseline to one-year follow-up on a continuous memory composite</w:t>
+        <w:rPr>
+          <w:rFonts w:ascii="Verdana" w:hAnsi="Verdana"/>
+          <w:sz w:val="22"/>
+          <w:szCs w:val="22"/>
+        </w:rPr>
+      </w:pPr>
+      <w:r>
+        <w:rPr>
+          <w:rFonts w:ascii="Verdana" w:eastAsia="Arial" w:hAnsi="Verdana" w:cs="Arial"/>
+          <w:sz w:val="22"/>
+          <w:szCs w:val="22"/>
+        </w:rPr>
+        <w:t>(1) one-year change scores for each episodic memory test administered separately — including the California Verbal Learning Test-II (CVLT-II), the Benson Figure recall task, and a story recall task (Mnemonic Similarity Task; MST) assessed at 30-minute and one-week delays</w:t>
+      </w:r>
+      <w:r>
+        <w:rPr>
+          <w:rFonts w:ascii="Verdana" w:eastAsia="Arial" w:hAnsi="Verdana" w:cs="Arial"/>
+          <w:sz w:val="22"/>
+          <w:szCs w:val="22"/>
+        </w:rPr>
+        <w:t xml:space="preserve"> </w:t>
       </w:r>
     </w:p>
     <w:p>
@@ -175,14 +203,19 @@
           <w:numId w:val="1"/>
         </w:numPr>
         <w:spacing w:after="120"/>
-      </w:pPr>
-      <w:r>
-        <w:rPr>
-          <w:rFonts w:ascii="Arial" w:eastAsia="Arial" w:hAnsi="Arial" w:cs="Arial"/>
-          <w:sz w:val="20"/>
-          <w:szCs w:val="20"/>
-        </w:rPr>
-        <w:t>(2) change in AD-signature cortical thickness (mm), derived from structural MRI at both time points</w:t>
+        <w:rPr>
+          <w:rFonts w:ascii="Verdana" w:hAnsi="Verdana"/>
+          <w:sz w:val="22"/>
+          <w:szCs w:val="22"/>
+        </w:rPr>
+      </w:pPr>
+      <w:r>
+        <w:rPr>
+          <w:rFonts w:ascii="Verdana" w:eastAsia="Arial" w:hAnsi="Verdana" w:cs="Arial"/>
+          <w:sz w:val="22"/>
+          <w:szCs w:val="22"/>
+        </w:rPr>
+        <w:t>(2) one-year change in mean AD-signature cortical thickness (mm), calculated as the mean across all AD cortical signature regions derived from structural MRI at both time points</w:t>
       </w:r>
     </w:p>
     <w:p>
@@ -193,12 +226,17 @@
           <w:numId w:val="1"/>
         </w:numPr>
         <w:spacing w:after="120"/>
-      </w:pPr>
-      <w:r>
-        <w:rPr>
-          <w:rFonts w:ascii="Arial" w:eastAsia="Arial" w:hAnsi="Arial" w:cs="Arial"/>
-          <w:sz w:val="20"/>
-          <w:szCs w:val="20"/>
+        <w:rPr>
+          <w:rFonts w:ascii="Verdana" w:hAnsi="Verdana"/>
+          <w:sz w:val="22"/>
+          <w:szCs w:val="22"/>
+        </w:rPr>
+      </w:pPr>
+      <w:r>
+        <w:rPr>
+          <w:rFonts w:ascii="Verdana" w:eastAsia="Arial" w:hAnsi="Verdana" w:cs="Arial"/>
+          <w:sz w:val="22"/>
+          <w:szCs w:val="22"/>
         </w:rPr>
         <w:t xml:space="preserve">Primary predictors are: </w:t>
       </w:r>
@@ -211,14 +249,27 @@
           <w:numId w:val="1"/>
         </w:numPr>
         <w:spacing w:after="120"/>
-      </w:pPr>
-      <w:r>
-        <w:rPr>
-          <w:rFonts w:ascii="Arial" w:eastAsia="Arial" w:hAnsi="Arial" w:cs="Arial"/>
-          <w:sz w:val="20"/>
-          <w:szCs w:val="20"/>
-        </w:rPr>
-        <w:t>(1) baseline plasma cytokine and chemokine levels (Hypothesis 1a)</w:t>
+        <w:rPr>
+          <w:rFonts w:ascii="Verdana" w:hAnsi="Verdana"/>
+          <w:sz w:val="22"/>
+          <w:szCs w:val="22"/>
+        </w:rPr>
+      </w:pPr>
+      <w:r>
+        <w:rPr>
+          <w:rFonts w:ascii="Verdana" w:eastAsia="Arial" w:hAnsi="Verdana" w:cs="Arial"/>
+          <w:sz w:val="22"/>
+          <w:szCs w:val="22"/>
+        </w:rPr>
+        <w:t>(1) baseline plasma levels of IL-6, TNF-α, MCP-1, and Eotaxin-1 (Hypothesis 1a)</w:t>
+      </w:r>
+      <w:r>
+        <w:rPr>
+          <w:rFonts w:ascii="Verdana" w:eastAsia="Arial" w:hAnsi="Verdana" w:cs="Arial"/>
+          <w:sz w:val="22"/>
+          <w:szCs w:val="22"/>
+        </w:rPr>
+        <w:t xml:space="preserve"> </w:t>
       </w:r>
     </w:p>
     <w:p>
@@ -229,21 +280,36 @@
           <w:numId w:val="1"/>
         </w:numPr>
         <w:spacing w:after="120"/>
-      </w:pPr>
-      <w:r>
-        <w:rPr>
-          <w:rFonts w:ascii="Arial" w:eastAsia="Arial" w:hAnsi="Arial" w:cs="Arial"/>
-          <w:sz w:val="20"/>
-          <w:szCs w:val="20"/>
-        </w:rPr>
-        <w:t>(2) change in plasma cytokine and chemokine levels from baseline to follow-up (Hypothesis 1b). Individual cytokines/chemokines will be examined separately as well as via a composite inflammatory index</w:t>
+        <w:rPr>
+          <w:rFonts w:ascii="Verdana" w:hAnsi="Verdana"/>
+          <w:sz w:val="22"/>
+          <w:szCs w:val="22"/>
+        </w:rPr>
+      </w:pPr>
+      <w:r>
+        <w:rPr>
+          <w:rFonts w:ascii="Verdana" w:eastAsia="Arial" w:hAnsi="Verdana" w:cs="Arial"/>
+          <w:sz w:val="22"/>
+          <w:szCs w:val="22"/>
+        </w:rPr>
+        <w:t>(2) change in those same four markers from baseline to follow-up (Hypothesis 1b).</w:t>
       </w:r>
     </w:p>
     <w:p>
       <w:pPr>
         <w:spacing w:after="120"/>
-      </w:pPr>
-      <w:r>
+        <w:rPr>
+          <w:rFonts w:ascii="Verdana" w:hAnsi="Verdana"/>
+          <w:sz w:val="22"/>
+          <w:szCs w:val="22"/>
+        </w:rPr>
+      </w:pPr>
+      <w:r>
+        <w:rPr>
+          <w:rFonts w:ascii="Verdana" w:hAnsi="Verdana"/>
+          <w:sz w:val="22"/>
+          <w:szCs w:val="22"/>
+        </w:rPr>
         <w:t>Aim 2:</w:t>
       </w:r>
     </w:p>
@@ -255,22 +321,19 @@
           <w:numId w:val="1"/>
         </w:numPr>
         <w:spacing w:after="120"/>
-      </w:pPr>
-      <w:r>
-        <w:rPr>
-          <w:rFonts w:ascii="Arial" w:eastAsia="Arial" w:hAnsi="Arial" w:cs="Arial"/>
-          <w:sz w:val="20"/>
-          <w:szCs w:val="20"/>
-        </w:rPr>
-        <w:t>H</w:t>
-      </w:r>
-      <w:r>
-        <w:rPr>
-          <w:rFonts w:ascii="Arial" w:eastAsia="Arial" w:hAnsi="Arial" w:cs="Arial"/>
-          <w:sz w:val="20"/>
-          <w:szCs w:val="20"/>
-        </w:rPr>
-        <w:t>ypothesis 2: The co-occurrence of elevated peripheral inflammatory markers and significant amyloid deposition will be the strongest predictor of one-year decline in episodic memory and AD-signature cortical thickness, beyond the independent effects of either factor alone.</w:t>
+        <w:rPr>
+          <w:rFonts w:ascii="Verdana" w:hAnsi="Verdana"/>
+          <w:sz w:val="22"/>
+          <w:szCs w:val="22"/>
+        </w:rPr>
+      </w:pPr>
+      <w:r>
+        <w:rPr>
+          <w:rFonts w:ascii="Verdana" w:eastAsia="Arial" w:hAnsi="Verdana" w:cs="Arial"/>
+          <w:sz w:val="22"/>
+          <w:szCs w:val="22"/>
+        </w:rPr>
+        <w:t>Hypothesis 2: The co-occurrence of elevated peripheral inflammatory markers and significant amyloid deposition will be the strongest predictor of one-year decline in episodic memory and AD-signature cortical thickness, beyond the independent effects of either factor alone.</w:t>
       </w:r>
     </w:p>
     <w:p>
@@ -281,12 +344,17 @@
           <w:numId w:val="1"/>
         </w:numPr>
         <w:spacing w:after="120"/>
-      </w:pPr>
-      <w:r>
-        <w:rPr>
-          <w:rFonts w:ascii="Arial" w:eastAsia="Arial" w:hAnsi="Arial" w:cs="Arial"/>
-          <w:sz w:val="20"/>
-          <w:szCs w:val="20"/>
+        <w:rPr>
+          <w:rFonts w:ascii="Verdana" w:hAnsi="Verdana"/>
+          <w:sz w:val="22"/>
+          <w:szCs w:val="22"/>
+        </w:rPr>
+      </w:pPr>
+      <w:r>
+        <w:rPr>
+          <w:rFonts w:ascii="Verdana" w:eastAsia="Arial" w:hAnsi="Verdana" w:cs="Arial"/>
+          <w:sz w:val="22"/>
+          <w:szCs w:val="22"/>
         </w:rPr>
         <w:t>Primary outcomes</w:t>
       </w:r>
@@ -299,12 +367,17 @@
           <w:numId w:val="1"/>
         </w:numPr>
         <w:spacing w:after="120"/>
-      </w:pPr>
-      <w:r>
-        <w:rPr>
-          <w:rFonts w:ascii="Arial" w:eastAsia="Arial" w:hAnsi="Arial" w:cs="Arial"/>
-          <w:sz w:val="20"/>
-          <w:szCs w:val="20"/>
+        <w:rPr>
+          <w:rFonts w:ascii="Verdana" w:hAnsi="Verdana"/>
+          <w:sz w:val="22"/>
+          <w:szCs w:val="22"/>
+        </w:rPr>
+      </w:pPr>
+      <w:r>
+        <w:rPr>
+          <w:rFonts w:ascii="Verdana" w:eastAsia="Arial" w:hAnsi="Verdana" w:cs="Arial"/>
+          <w:sz w:val="22"/>
+          <w:szCs w:val="22"/>
         </w:rPr>
         <w:t>Identical to Aim 1</w:t>
       </w:r>
@@ -317,12 +390,17 @@
           <w:numId w:val="1"/>
         </w:numPr>
         <w:spacing w:after="120"/>
-      </w:pPr>
-      <w:r>
-        <w:rPr>
-          <w:rFonts w:ascii="Arial" w:eastAsia="Arial" w:hAnsi="Arial" w:cs="Arial"/>
-          <w:sz w:val="20"/>
-          <w:szCs w:val="20"/>
+        <w:rPr>
+          <w:rFonts w:ascii="Verdana" w:hAnsi="Verdana"/>
+          <w:sz w:val="22"/>
+          <w:szCs w:val="22"/>
+        </w:rPr>
+      </w:pPr>
+      <w:r>
+        <w:rPr>
+          <w:rFonts w:ascii="Verdana" w:eastAsia="Arial" w:hAnsi="Verdana" w:cs="Arial"/>
+          <w:sz w:val="22"/>
+          <w:szCs w:val="22"/>
         </w:rPr>
         <w:t>Primary predictors:</w:t>
       </w:r>
@@ -334,15 +412,19 @@
           <w:ilvl w:val="1"/>
           <w:numId w:val="1"/>
         </w:numPr>
-        <w:spacing w:after="120"/>
-      </w:pPr>
-      <w:r>
-        <w:rPr>
-          <w:rFonts w:ascii="Arial" w:eastAsia="Arial" w:hAnsi="Arial" w:cs="Arial"/>
-          <w:sz w:val="20"/>
-          <w:szCs w:val="20"/>
-        </w:rPr>
-        <w:t xml:space="preserve">(1) peripheral inflammatory marker levels (as in Aim 1); </w:t>
+        <w:rPr>
+          <w:rFonts w:ascii="Verdana" w:eastAsia="Arial" w:hAnsi="Verdana" w:cs="Arial"/>
+          <w:sz w:val="22"/>
+          <w:szCs w:val="22"/>
+        </w:rPr>
+      </w:pPr>
+      <w:r>
+        <w:rPr>
+          <w:rFonts w:ascii="Verdana" w:eastAsia="Arial" w:hAnsi="Verdana" w:cs="Arial"/>
+          <w:sz w:val="22"/>
+          <w:szCs w:val="22"/>
+        </w:rPr>
+        <w:t xml:space="preserve">(1) plasma levels of IL-6, TNF-alpha, MCP-1, and Eotaxin-1; </w:t>
       </w:r>
     </w:p>
     <w:p>
@@ -352,15 +434,19 @@
           <w:ilvl w:val="1"/>
           <w:numId w:val="1"/>
         </w:numPr>
-        <w:spacing w:after="120"/>
-      </w:pPr>
-      <w:r>
-        <w:rPr>
-          <w:rFonts w:ascii="Arial" w:eastAsia="Arial" w:hAnsi="Arial" w:cs="Arial"/>
-          <w:sz w:val="20"/>
-          <w:szCs w:val="20"/>
-        </w:rPr>
-        <w:t xml:space="preserve">(2) amyloid deposition, measured as a continuous PET SUVR or binary amyloid-positive/negative classification </w:t>
+        <w:rPr>
+          <w:rFonts w:ascii="Verdana" w:eastAsia="Arial" w:hAnsi="Verdana" w:cs="Arial"/>
+          <w:sz w:val="22"/>
+          <w:szCs w:val="22"/>
+        </w:rPr>
+      </w:pPr>
+      <w:r>
+        <w:rPr>
+          <w:rFonts w:ascii="Verdana" w:eastAsia="Arial" w:hAnsi="Verdana" w:cs="Arial"/>
+          <w:sz w:val="22"/>
+          <w:szCs w:val="22"/>
+        </w:rPr>
+        <w:t xml:space="preserve">(2) amyloid deposition as a continuous PET SUVR variable; and </w:t>
       </w:r>
     </w:p>
     <w:p>
@@ -370,15 +456,20 @@
           <w:ilvl w:val="1"/>
           <w:numId w:val="1"/>
         </w:numPr>
-        <w:spacing w:after="120"/>
-      </w:pPr>
-      <w:r>
-        <w:rPr>
-          <w:rFonts w:ascii="Arial" w:eastAsia="Arial" w:hAnsi="Arial" w:cs="Arial"/>
-          <w:sz w:val="20"/>
-          <w:szCs w:val="20"/>
-        </w:rPr>
-        <w:t>(3) the interaction between inflammatory markers and amyloid status.</w:t>
+        <w:rPr>
+          <w:rFonts w:ascii="Verdana" w:eastAsia="Arial" w:hAnsi="Verdana" w:cs="Arial"/>
+          <w:sz w:val="22"/>
+          <w:szCs w:val="22"/>
+        </w:rPr>
+      </w:pPr>
+      <w:r>
+        <w:rPr>
+          <w:rFonts w:ascii="Verdana" w:eastAsia="Arial" w:hAnsi="Verdana" w:cs="Arial"/>
+          <w:sz w:val="22"/>
+          <w:szCs w:val="22"/>
+        </w:rPr>
+        <w:lastRenderedPageBreak/>
+        <w:t>(3) the multiplicative interaction between each inflammatory marker and amyloid SUVR.</w:t>
       </w:r>
     </w:p>
     <w:p>
@@ -387,12 +478,153 @@
         <w:shd w:val="clear" w:color="auto" w:fill="FFFFFF"/>
         <w:spacing w:before="180" w:beforeAutospacing="0" w:after="180" w:afterAutospacing="0"/>
         <w:rPr>
-          <w:rFonts w:asciiTheme="minorHAnsi" w:hAnsiTheme="minorHAnsi"/>
+          <w:rFonts w:ascii="Verdana" w:hAnsi="Verdana"/>
           <w:color w:val="273540"/>
           <w:sz w:val="22"/>
           <w:szCs w:val="22"/>
         </w:rPr>
       </w:pPr>
+      <w:r>
+        <w:rPr>
+          <w:rFonts w:ascii="Verdana" w:hAnsi="Verdana"/>
+          <w:color w:val="273540"/>
+          <w:sz w:val="22"/>
+          <w:szCs w:val="22"/>
+        </w:rPr>
+        <w:t>2. The over-all analysis approach you will be using for each hypothesis</w:t>
+      </w:r>
+    </w:p>
+    <w:p>
+      <w:pPr>
+        <w:pStyle w:val="NormalWeb"/>
+        <w:numPr>
+          <w:ilvl w:val="0"/>
+          <w:numId w:val="2"/>
+        </w:numPr>
+        <w:shd w:val="clear" w:color="auto" w:fill="FFFFFF"/>
+        <w:spacing w:before="180" w:beforeAutospacing="0" w:after="180" w:afterAutospacing="0"/>
+        <w:rPr>
+          <w:rFonts w:ascii="Verdana" w:hAnsi="Verdana"/>
+          <w:color w:val="273540"/>
+          <w:sz w:val="22"/>
+          <w:szCs w:val="22"/>
+        </w:rPr>
+      </w:pPr>
+      <w:r>
+        <w:rPr>
+          <w:rFonts w:ascii="Verdana" w:eastAsia="Arial" w:hAnsi="Verdana" w:cs="Arial"/>
+          <w:sz w:val="22"/>
+          <w:szCs w:val="22"/>
+        </w:rPr>
+        <w:t xml:space="preserve">Hypothesis 1a, separate linear regression models will be fit for each cytokine/chemokine (4 markers) by outcome (memory tests and cortical thickness) combination, with change scores as the dependent variable and baseline score on the relevant outcome included as a covariate. </w:t>
+      </w:r>
+    </w:p>
+    <w:p>
+      <w:pPr>
+        <w:pStyle w:val="NormalWeb"/>
+        <w:numPr>
+          <w:ilvl w:val="0"/>
+          <w:numId w:val="2"/>
+        </w:numPr>
+        <w:shd w:val="clear" w:color="auto" w:fill="FFFFFF"/>
+        <w:spacing w:before="180" w:after="180"/>
+        <w:rPr>
+          <w:rFonts w:ascii="Verdana" w:eastAsia="Arial" w:hAnsi="Verdana" w:cs="Arial"/>
+          <w:sz w:val="22"/>
+          <w:szCs w:val="22"/>
+        </w:rPr>
+      </w:pPr>
+      <w:r>
+        <w:rPr>
+          <w:rFonts w:ascii="Verdana" w:eastAsia="Arial" w:hAnsi="Verdana" w:cs="Arial"/>
+          <w:sz w:val="22"/>
+          <w:szCs w:val="22"/>
+        </w:rPr>
+        <w:t>Hypothesis 1b, identical models will be fit with change in cytokine/chemokine levels as the predictor. This two-timepoint change score approach is appropriate given the study design of baseline and one-year follow-up only.</w:t>
+      </w:r>
+    </w:p>
+    <w:p>
+      <w:pPr>
+        <w:pStyle w:val="NormalWeb"/>
+        <w:numPr>
+          <w:ilvl w:val="0"/>
+          <w:numId w:val="2"/>
+        </w:numPr>
+        <w:shd w:val="clear" w:color="auto" w:fill="FFFFFF"/>
+        <w:spacing w:before="180" w:beforeAutospacing="0" w:after="180" w:afterAutospacing="0"/>
+        <w:rPr>
+          <w:rFonts w:ascii="Verdana" w:hAnsi="Verdana"/>
+          <w:color w:val="273540"/>
+          <w:sz w:val="22"/>
+          <w:szCs w:val="22"/>
+        </w:rPr>
+      </w:pPr>
+      <w:r>
+        <w:rPr>
+          <w:rFonts w:ascii="Verdana" w:eastAsia="Arial" w:hAnsi="Verdana" w:cs="Arial"/>
+          <w:sz w:val="22"/>
+          <w:szCs w:val="22"/>
+        </w:rPr>
+        <w:t xml:space="preserve">Covariates will include age, sex, APOE-e4 status (carrier vs. non-carrier), years of education, and cardiovascular and immune-related health variables (BMI, history of hypercholesterolemia, NSAID use, and immune-related health conditions). </w:t>
+      </w:r>
+    </w:p>
+    <w:p>
+      <w:pPr>
+        <w:pStyle w:val="NormalWeb"/>
+        <w:numPr>
+          <w:ilvl w:val="0"/>
+          <w:numId w:val="2"/>
+        </w:numPr>
+        <w:shd w:val="clear" w:color="auto" w:fill="FFFFFF"/>
+        <w:spacing w:before="180" w:beforeAutospacing="0" w:after="180" w:afterAutospacing="0"/>
+        <w:rPr>
+          <w:rFonts w:ascii="Verdana" w:hAnsi="Verdana"/>
+          <w:color w:val="273540"/>
+          <w:sz w:val="22"/>
+          <w:szCs w:val="22"/>
+        </w:rPr>
+      </w:pPr>
+      <w:r>
+        <w:rPr>
+          <w:rFonts w:ascii="Verdana" w:eastAsia="Arial" w:hAnsi="Verdana" w:cs="Arial"/>
+          <w:sz w:val="22"/>
+          <w:szCs w:val="22"/>
+        </w:rPr>
+        <w:t xml:space="preserve">Hypothesis 2: </w:t>
+      </w:r>
+      <w:r>
+        <w:rPr>
+          <w:rFonts w:ascii="Verdana" w:eastAsia="Arial" w:hAnsi="Verdana" w:cs="Arial"/>
+          <w:sz w:val="22"/>
+          <w:szCs w:val="22"/>
+        </w:rPr>
+        <w:t>hypothesis will be tested using linear regression models that include the main effect of each inflammatory marker, the main effect of amyloid SUVR, and their multiplicative interaction term, with one-year change scores as outcomes</w:t>
+      </w:r>
+    </w:p>
+    <w:p>
+      <w:pPr>
+        <w:pStyle w:val="NormalWeb"/>
+        <w:numPr>
+          <w:ilvl w:val="1"/>
+          <w:numId w:val="2"/>
+        </w:numPr>
+        <w:shd w:val="clear" w:color="auto" w:fill="FFFFFF"/>
+        <w:spacing w:before="180" w:beforeAutospacing="0" w:after="180" w:afterAutospacing="0"/>
+        <w:rPr>
+          <w:rFonts w:ascii="Verdana" w:hAnsi="Verdana"/>
+          <w:color w:val="273540"/>
+          <w:sz w:val="22"/>
+          <w:szCs w:val="22"/>
+        </w:rPr>
+      </w:pPr>
+      <w:r>
+        <w:rPr>
+          <w:rFonts w:ascii="Verdana" w:eastAsia="Arial" w:hAnsi="Verdana" w:cs="Arial"/>
+          <w:sz w:val="22"/>
+          <w:szCs w:val="22"/>
+        </w:rPr>
+        <w:t>Covariates will mirror those in Aim 1</w:t>
+      </w:r>
     </w:p>
     <w:p>
       <w:pPr>
@@ -400,7 +632,7 @@
         <w:shd w:val="clear" w:color="auto" w:fill="FFFFFF"/>
         <w:spacing w:before="180" w:beforeAutospacing="0" w:after="180" w:afterAutospacing="0"/>
         <w:rPr>
-          <w:rFonts w:asciiTheme="minorHAnsi" w:hAnsiTheme="minorHAnsi"/>
+          <w:rFonts w:ascii="Verdana" w:hAnsi="Verdana"/>
           <w:color w:val="273540"/>
           <w:sz w:val="22"/>
           <w:szCs w:val="22"/>
@@ -408,146 +640,12 @@
       </w:pPr>
       <w:r>
         <w:rPr>
-          <w:rFonts w:asciiTheme="minorHAnsi" w:hAnsiTheme="minorHAnsi"/>
+          <w:rFonts w:ascii="Verdana" w:hAnsi="Verdana"/>
           <w:color w:val="273540"/>
           <w:sz w:val="22"/>
           <w:szCs w:val="22"/>
         </w:rPr>
-        <w:t>2. The over-all analysis approach you will be using for each hypothesis</w:t>
-      </w:r>
-    </w:p>
-    <w:p>
-      <w:pPr>
-        <w:pStyle w:val="NormalWeb"/>
-        <w:numPr>
-          <w:ilvl w:val="0"/>
-          <w:numId w:val="2"/>
-        </w:numPr>
-        <w:shd w:val="clear" w:color="auto" w:fill="FFFFFF"/>
-        <w:spacing w:before="180" w:beforeAutospacing="0" w:after="180" w:afterAutospacing="0"/>
-        <w:rPr>
-          <w:rFonts w:asciiTheme="minorHAnsi" w:hAnsiTheme="minorHAnsi"/>
-          <w:color w:val="273540"/>
-          <w:sz w:val="22"/>
-          <w:szCs w:val="22"/>
-        </w:rPr>
-      </w:pPr>
-      <w:r>
-        <w:rPr>
-          <w:rFonts w:ascii="Arial" w:eastAsia="Arial" w:hAnsi="Arial" w:cs="Arial"/>
-          <w:sz w:val="20"/>
-          <w:szCs w:val="20"/>
-        </w:rPr>
-        <w:t>Hypothesis 1a, linear regression models will be used to examine the association between baseline cytokine/chemokine levels and one-year change in each outcome (memory and cortical thickness), with change scores as the dependent variable and baseline outcome score included as a covariate</w:t>
-      </w:r>
-    </w:p>
-    <w:p>
-      <w:pPr>
-        <w:pStyle w:val="NormalWeb"/>
-        <w:numPr>
-          <w:ilvl w:val="0"/>
-          <w:numId w:val="2"/>
-        </w:numPr>
-        <w:shd w:val="clear" w:color="auto" w:fill="FFFFFF"/>
-        <w:spacing w:before="180" w:beforeAutospacing="0" w:after="180" w:afterAutospacing="0"/>
-        <w:rPr>
-          <w:rFonts w:asciiTheme="minorHAnsi" w:hAnsiTheme="minorHAnsi"/>
-          <w:color w:val="273540"/>
-          <w:sz w:val="22"/>
-          <w:szCs w:val="22"/>
-        </w:rPr>
-      </w:pPr>
-      <w:r>
-        <w:rPr>
-          <w:rFonts w:ascii="Arial" w:eastAsia="Arial" w:hAnsi="Arial" w:cs="Arial"/>
-          <w:sz w:val="20"/>
-          <w:szCs w:val="20"/>
-        </w:rPr>
-        <w:lastRenderedPageBreak/>
-        <w:t>Hypothesis 1b, similar models will be fit with change in cytokine/chemokine levels as the predictor. Given the longitudinal design with only two time points and continuous outcomes, linear regression with change scores is the primary approach</w:t>
-      </w:r>
-    </w:p>
-    <w:p>
-      <w:pPr>
-        <w:pStyle w:val="NormalWeb"/>
-        <w:numPr>
-          <w:ilvl w:val="0"/>
-          <w:numId w:val="2"/>
-        </w:numPr>
-        <w:shd w:val="clear" w:color="auto" w:fill="FFFFFF"/>
-        <w:spacing w:before="180" w:beforeAutospacing="0" w:after="180" w:afterAutospacing="0"/>
-        <w:rPr>
-          <w:rFonts w:asciiTheme="minorHAnsi" w:hAnsiTheme="minorHAnsi"/>
-          <w:color w:val="273540"/>
-          <w:sz w:val="22"/>
-          <w:szCs w:val="22"/>
-        </w:rPr>
-      </w:pPr>
-      <w:r>
-        <w:rPr>
-          <w:rFonts w:ascii="Arial" w:eastAsia="Arial" w:hAnsi="Arial" w:cs="Arial"/>
-          <w:sz w:val="20"/>
-          <w:szCs w:val="20"/>
-        </w:rPr>
-        <w:t>Covariates will include age, sex, APOE-e4 status, years of education, and a cardiovascular/immune health composite (incorporating BMI, history of hypercholesterolemia, NSAID use, and immune-related health conditions).</w:t>
-      </w:r>
-    </w:p>
-    <w:p>
-      <w:pPr>
-        <w:pStyle w:val="NormalWeb"/>
-        <w:numPr>
-          <w:ilvl w:val="0"/>
-          <w:numId w:val="2"/>
-        </w:numPr>
-        <w:shd w:val="clear" w:color="auto" w:fill="FFFFFF"/>
-        <w:spacing w:before="180" w:beforeAutospacing="0" w:after="180" w:afterAutospacing="0"/>
-        <w:rPr>
-          <w:rFonts w:asciiTheme="minorHAnsi" w:hAnsiTheme="minorHAnsi"/>
-          <w:color w:val="273540"/>
-          <w:sz w:val="22"/>
-          <w:szCs w:val="22"/>
-        </w:rPr>
-      </w:pPr>
-      <w:r>
-        <w:rPr>
-          <w:rFonts w:ascii="Arial" w:eastAsia="Arial" w:hAnsi="Arial" w:cs="Arial"/>
-          <w:sz w:val="20"/>
-          <w:szCs w:val="20"/>
-        </w:rPr>
-        <w:t>Hypothesis 2:</w:t>
-      </w:r>
-      <w:r>
-        <w:rPr>
-          <w:rFonts w:ascii="Arial" w:eastAsia="Arial" w:hAnsi="Arial" w:cs="Arial"/>
-          <w:sz w:val="20"/>
-          <w:szCs w:val="20"/>
-        </w:rPr>
-        <w:t xml:space="preserve"> will be tested using linear regression models that include main effects of both peripheral inflammation and amyloid deposition, as well as their multiplicative interaction term, with one-year change scores as outcomes. </w:t>
-      </w:r>
-    </w:p>
-    <w:p>
-      <w:pPr>
-        <w:pStyle w:val="NormalWeb"/>
-        <w:numPr>
-          <w:ilvl w:val="1"/>
-          <w:numId w:val="2"/>
-        </w:numPr>
-        <w:shd w:val="clear" w:color="auto" w:fill="FFFFFF"/>
-        <w:spacing w:before="180" w:beforeAutospacing="0" w:after="180" w:afterAutospacing="0"/>
-        <w:rPr>
-          <w:rFonts w:asciiTheme="minorHAnsi" w:hAnsiTheme="minorHAnsi"/>
-          <w:color w:val="273540"/>
-          <w:sz w:val="22"/>
-          <w:szCs w:val="22"/>
-        </w:rPr>
-      </w:pPr>
-      <w:r>
-        <w:rPr>
-          <w:rFonts w:ascii="Arial" w:eastAsia="Arial" w:hAnsi="Arial" w:cs="Arial"/>
-          <w:sz w:val="20"/>
-          <w:szCs w:val="20"/>
-        </w:rPr>
-        <w:t>Covariates will mirror those in Aim 1 (age, sex, APOE-e4 status, education, cardiovascular/immune health).</w:t>
+        <w:t>3. How you will approach/incorporate the other data/variables available besides the outcomes and predictors of interest</w:t>
       </w:r>
     </w:p>
     <w:p>
@@ -556,7 +654,7 @@
         <w:shd w:val="clear" w:color="auto" w:fill="FFFFFF"/>
         <w:spacing w:before="180" w:beforeAutospacing="0" w:after="180" w:afterAutospacing="0"/>
         <w:rPr>
-          <w:rFonts w:asciiTheme="minorHAnsi" w:hAnsiTheme="minorHAnsi"/>
+          <w:rFonts w:ascii="Verdana" w:hAnsi="Verdana"/>
           <w:color w:val="273540"/>
           <w:sz w:val="22"/>
           <w:szCs w:val="22"/>
@@ -564,12 +662,12 @@
       </w:pPr>
       <w:r>
         <w:rPr>
-          <w:rFonts w:asciiTheme="minorHAnsi" w:hAnsiTheme="minorHAnsi"/>
+          <w:rFonts w:ascii="Verdana" w:hAnsi="Verdana"/>
           <w:color w:val="273540"/>
           <w:sz w:val="22"/>
           <w:szCs w:val="22"/>
         </w:rPr>
-        <w:t>3. How you will approach/incorporate the other data/variables available besides the outcomes and predictors of interest</w:t>
+        <w:t>All models in Aims 1 and 2 will include age, sex, APOE-ε4 carrier status, and years of education as covariates, given their well-established associations with both inflammatory markers and cognitive aging. These variables will be entered as a covariate block in all primary regression models.</w:t>
       </w:r>
     </w:p>
     <w:p>
@@ -578,12 +676,57 @@
         <w:shd w:val="clear" w:color="auto" w:fill="FFFFFF"/>
         <w:spacing w:before="180" w:beforeAutospacing="0" w:after="180" w:afterAutospacing="0"/>
         <w:rPr>
-          <w:rFonts w:asciiTheme="minorHAnsi" w:hAnsiTheme="minorHAnsi"/>
+          <w:rFonts w:ascii="Verdana" w:hAnsi="Verdana"/>
           <w:color w:val="273540"/>
           <w:sz w:val="22"/>
           <w:szCs w:val="22"/>
         </w:rPr>
       </w:pPr>
+      <w:r>
+        <w:rPr>
+          <w:rFonts w:ascii="Verdana" w:hAnsi="Verdana"/>
+          <w:color w:val="273540"/>
+          <w:sz w:val="22"/>
+          <w:szCs w:val="22"/>
+        </w:rPr>
+        <w:t>Beyond these standard covariates, cardiovascular and immune-related health variables available in the dataset</w:t>
+      </w:r>
+      <w:r>
+        <w:rPr>
+          <w:rFonts w:ascii="Verdana" w:hAnsi="Verdana"/>
+          <w:color w:val="273540"/>
+          <w:sz w:val="22"/>
+          <w:szCs w:val="22"/>
+        </w:rPr>
+        <w:t xml:space="preserve">, </w:t>
+      </w:r>
+      <w:r>
+        <w:rPr>
+          <w:rFonts w:ascii="Verdana" w:hAnsi="Verdana"/>
+          <w:color w:val="273540"/>
+          <w:sz w:val="22"/>
+          <w:szCs w:val="22"/>
+        </w:rPr>
+        <w:t>including BMI, history of hypercholesterolemia, NSAID use, and immune-related health conditions</w:t>
+      </w:r>
+      <w:r>
+        <w:rPr>
+          <w:rFonts w:ascii="Verdana" w:hAnsi="Verdana"/>
+          <w:color w:val="273540"/>
+          <w:sz w:val="22"/>
+          <w:szCs w:val="22"/>
+        </w:rPr>
+        <w:t>,</w:t>
+      </w:r>
+      <w:r>
+        <w:rPr>
+          <w:rFonts w:ascii="Verdana" w:hAnsi="Verdana"/>
+          <w:color w:val="273540"/>
+          <w:sz w:val="22"/>
+          <w:szCs w:val="22"/>
+        </w:rPr>
+        <w:t xml:space="preserve"> will be evaluated for inclusion. Because these variables are conceptually related and expected to correlate with one another, variance inflation factors (VIF) will be examined prior to model fitting. Any variable with VIF &gt; 10 will be flagged; if collinearity is problematic across multiple variables, a summary score will be derived or the least informative variable dropped to maintain model stability.</w:t>
+      </w:r>
     </w:p>
     <w:p>
       <w:pPr>
@@ -591,7 +734,82 @@
         <w:shd w:val="clear" w:color="auto" w:fill="FFFFFF"/>
         <w:spacing w:before="180" w:beforeAutospacing="0" w:after="180" w:afterAutospacing="0"/>
         <w:rPr>
-          <w:rFonts w:asciiTheme="minorHAnsi" w:hAnsiTheme="minorHAnsi"/>
+          <w:rFonts w:ascii="Verdana" w:hAnsi="Verdana"/>
+          <w:color w:val="273540"/>
+          <w:sz w:val="22"/>
+          <w:szCs w:val="22"/>
+        </w:rPr>
+      </w:pPr>
+      <w:r>
+        <w:rPr>
+          <w:rFonts w:ascii="Verdana" w:hAnsi="Verdana"/>
+          <w:color w:val="273540"/>
+          <w:sz w:val="22"/>
+          <w:szCs w:val="22"/>
+        </w:rPr>
+        <w:t>4. What power/sample size calculations you will conduct for each of the hypotheses of interest</w:t>
+      </w:r>
+    </w:p>
+    <w:p>
+      <w:pPr>
+        <w:pStyle w:val="NormalWeb"/>
+        <w:numPr>
+          <w:ilvl w:val="0"/>
+          <w:numId w:val="3"/>
+        </w:numPr>
+        <w:shd w:val="clear" w:color="auto" w:fill="FFFFFF"/>
+        <w:spacing w:before="180" w:beforeAutospacing="0" w:after="180" w:afterAutospacing="0"/>
+        <w:rPr>
+          <w:rFonts w:ascii="Verdana" w:hAnsi="Verdana"/>
+          <w:color w:val="273540"/>
+          <w:sz w:val="22"/>
+          <w:szCs w:val="22"/>
+        </w:rPr>
+      </w:pPr>
+      <w:r>
+        <w:rPr>
+          <w:rFonts w:ascii="Verdana" w:eastAsia="Arial" w:hAnsi="Verdana" w:cs="Arial"/>
+          <w:sz w:val="22"/>
+          <w:szCs w:val="22"/>
+        </w:rPr>
+        <w:t>Aim 1 will be conducted in R for multiple linear regression, evaluating the ability to detect the contribution of cytokine/chemokine predictors over and above covariates. Calculations will be based on the projected final analytic sample of 175 participants (125 aMCI + 50 HC combined, after ~10% attrition from 192 enrolled)</w:t>
+      </w:r>
+    </w:p>
+    <w:p>
+      <w:pPr>
+        <w:pStyle w:val="ListParagraph"/>
+        <w:numPr>
+          <w:ilvl w:val="0"/>
+          <w:numId w:val="3"/>
+        </w:numPr>
+        <w:spacing w:after="120"/>
+        <w:rPr>
+          <w:rFonts w:ascii="Verdana" w:hAnsi="Verdana"/>
+          <w:sz w:val="22"/>
+          <w:szCs w:val="22"/>
+        </w:rPr>
+      </w:pPr>
+      <w:r>
+        <w:rPr>
+          <w:rFonts w:ascii="Verdana" w:eastAsia="Arial" w:hAnsi="Verdana" w:cs="Arial"/>
+          <w:sz w:val="22"/>
+          <w:szCs w:val="22"/>
+        </w:rPr>
+        <w:lastRenderedPageBreak/>
+        <w:t>Aim 2 will be conducted in R for the detection of a statistically significant interaction term in multiple linear regression. Interaction effects are typically smaller than main effects; accordingly, literature-based estimates of interaction effect sizes in comparable inflammation x amyloid studies will be used, and sensitivity analyses across a range of plausible effect sizes will be reported. The same projected analytic sample of 175 participants applies. Power will be reported for each outcome (memory and cortical thickness) separately.</w:t>
+      </w:r>
+    </w:p>
+    <w:p>
+      <w:pPr>
+        <w:pStyle w:val="NormalWeb"/>
+        <w:numPr>
+          <w:ilvl w:val="0"/>
+          <w:numId w:val="3"/>
+        </w:numPr>
+        <w:shd w:val="clear" w:color="auto" w:fill="FFFFFF"/>
+        <w:spacing w:before="180" w:beforeAutospacing="0" w:after="180" w:afterAutospacing="0"/>
+        <w:rPr>
+          <w:rFonts w:ascii="Verdana" w:hAnsi="Verdana"/>
           <w:color w:val="273540"/>
           <w:sz w:val="22"/>
           <w:szCs w:val="22"/>
@@ -604,7 +822,7 @@
         <w:shd w:val="clear" w:color="auto" w:fill="FFFFFF"/>
         <w:spacing w:before="180" w:beforeAutospacing="0" w:after="180" w:afterAutospacing="0"/>
         <w:rPr>
-          <w:rFonts w:asciiTheme="minorHAnsi" w:hAnsiTheme="minorHAnsi"/>
+          <w:rFonts w:ascii="Verdana" w:hAnsi="Verdana"/>
           <w:color w:val="273540"/>
           <w:sz w:val="22"/>
           <w:szCs w:val="22"/>
@@ -612,37 +830,544 @@
       </w:pPr>
       <w:r>
         <w:rPr>
-          <w:rFonts w:asciiTheme="minorHAnsi" w:hAnsiTheme="minorHAnsi"/>
+          <w:rFonts w:ascii="Verdana" w:hAnsi="Verdana"/>
           <w:color w:val="273540"/>
           <w:sz w:val="22"/>
           <w:szCs w:val="22"/>
         </w:rPr>
-        <w:t>4. What power/sample size calculations you will conduct for each of the hypotheses of interest</w:t>
-      </w:r>
-    </w:p>
-    <w:p>
-      <w:pPr>
-        <w:pStyle w:val="NormalWeb"/>
+        <w:t>5. Not required for interim, but will be required for final: thoughts on your approach to type I error control.</w:t>
+      </w:r>
+    </w:p>
+    <w:p>
+      <w:pPr>
+        <w:rPr>
+          <w:rFonts w:ascii="Verdana" w:hAnsi="Verdana"/>
+          <w:sz w:val="22"/>
+          <w:szCs w:val="22"/>
+        </w:rPr>
+      </w:pPr>
+    </w:p>
+    <w:p>
+      <w:pPr>
+        <w:rPr>
+          <w:rFonts w:ascii="Verdana" w:hAnsi="Verdana"/>
+          <w:sz w:val="22"/>
+          <w:szCs w:val="22"/>
+        </w:rPr>
+      </w:pPr>
+      <w:r>
+        <w:rPr>
+          <w:rFonts w:ascii="Verdana" w:hAnsi="Verdana"/>
+          <w:sz w:val="22"/>
+          <w:szCs w:val="22"/>
+        </w:rPr>
+        <w:br w:type="page"/>
+      </w:r>
+    </w:p>
+    <w:p>
+      <w:pPr>
+        <w:rPr>
+          <w:rFonts w:ascii="Verdana" w:hAnsi="Verdana"/>
+          <w:sz w:val="22"/>
+          <w:szCs w:val="22"/>
+        </w:rPr>
+      </w:pPr>
+      <w:r>
+        <w:rPr>
+          <w:rFonts w:ascii="Verdana" w:hAnsi="Verdana"/>
+          <w:sz w:val="22"/>
+          <w:szCs w:val="22"/>
+        </w:rPr>
+        <w:lastRenderedPageBreak/>
+        <w:t>PI Questions</w:t>
+      </w:r>
+      <w:r>
+        <w:rPr>
+          <w:rFonts w:ascii="Verdana" w:hAnsi="Verdana"/>
+          <w:sz w:val="22"/>
+          <w:szCs w:val="22"/>
+        </w:rPr>
+        <w:t>/Notes from Class:</w:t>
+      </w:r>
+    </w:p>
+    <w:p>
+      <w:pPr>
+        <w:pStyle w:val="ListParagraph"/>
+        <w:numPr>
+          <w:ilvl w:val="0"/>
+          <w:numId w:val="4"/>
+        </w:numPr>
+        <w:rPr>
+          <w:rFonts w:ascii="Verdana" w:hAnsi="Verdana"/>
+          <w:sz w:val="22"/>
+          <w:szCs w:val="22"/>
+        </w:rPr>
+      </w:pPr>
+      <w:r>
+        <w:rPr>
+          <w:rFonts w:ascii="Verdana" w:hAnsi="Verdana"/>
+          <w:b/>
+          <w:bCs/>
+          <w:sz w:val="22"/>
+          <w:szCs w:val="22"/>
+        </w:rPr>
+        <w:t xml:space="preserve"> How is episodic memory measured?</w:t>
+      </w:r>
+      <w:r>
+        <w:rPr>
+          <w:rFonts w:ascii="Verdana" w:hAnsi="Verdana"/>
+          <w:sz w:val="22"/>
+          <w:szCs w:val="22"/>
+        </w:rPr>
+        <w:t xml:space="preserve"> A single test score, a composite of multiple tests, or something else? Is change simply follow-up minus baseline, or is reliable change index used? </w:t>
+      </w:r>
+    </w:p>
+    <w:p>
+      <w:pPr>
+        <w:pStyle w:val="ListParagraph"/>
+        <w:numPr>
+          <w:ilvl w:val="1"/>
+          <w:numId w:val="4"/>
+        </w:numPr>
+        <w:rPr>
+          <w:rFonts w:ascii="Verdana" w:hAnsi="Verdana"/>
+          <w:sz w:val="22"/>
+          <w:szCs w:val="22"/>
+        </w:rPr>
+      </w:pPr>
+      <w:r>
+        <w:rPr>
+          <w:rFonts w:ascii="Verdana" w:hAnsi="Verdana"/>
+          <w:sz w:val="22"/>
+          <w:szCs w:val="22"/>
+        </w:rPr>
+        <w:t>Keep the test scores separately</w:t>
+      </w:r>
+      <w:r>
+        <w:rPr>
+          <w:rFonts w:ascii="Verdana" w:hAnsi="Verdana"/>
+          <w:sz w:val="22"/>
+          <w:szCs w:val="22"/>
+        </w:rPr>
+        <w:t>, do not combine the memory test scores into a composite score</w:t>
+      </w:r>
+    </w:p>
+    <w:p>
+      <w:pPr>
+        <w:pStyle w:val="ListParagraph"/>
+        <w:numPr>
+          <w:ilvl w:val="0"/>
+          <w:numId w:val="4"/>
+        </w:numPr>
+        <w:rPr>
+          <w:rFonts w:ascii="Verdana" w:hAnsi="Verdana"/>
+          <w:sz w:val="22"/>
+          <w:szCs w:val="22"/>
+        </w:rPr>
+      </w:pPr>
+      <w:r>
+        <w:rPr>
+          <w:rFonts w:ascii="Verdana" w:hAnsi="Verdana"/>
+          <w:b/>
+          <w:bCs/>
+          <w:sz w:val="22"/>
+          <w:szCs w:val="22"/>
+        </w:rPr>
+        <w:t>How many cytokines/chemokines are being measured, and what are they?</w:t>
+      </w:r>
+      <w:r>
+        <w:rPr>
+          <w:rFonts w:ascii="Verdana" w:hAnsi="Verdana"/>
+          <w:sz w:val="22"/>
+          <w:szCs w:val="22"/>
+        </w:rPr>
+        <w:t xml:space="preserve"> The exact number directly determines how stringent the FDR correction needs to be and drives the power calculations. </w:t>
+      </w:r>
+    </w:p>
+    <w:p>
+      <w:pPr>
+        <w:pStyle w:val="ListParagraph"/>
+        <w:numPr>
+          <w:ilvl w:val="1"/>
+          <w:numId w:val="4"/>
+        </w:numPr>
+        <w:rPr>
+          <w:rFonts w:ascii="Verdana" w:hAnsi="Verdana"/>
+          <w:sz w:val="22"/>
+          <w:szCs w:val="22"/>
+        </w:rPr>
+      </w:pPr>
+      <w:r>
+        <w:rPr>
+          <w:rFonts w:ascii="Verdana" w:hAnsi="Verdana"/>
+          <w:sz w:val="22"/>
+          <w:szCs w:val="22"/>
+        </w:rPr>
+        <w:t xml:space="preserve">Panel measures 10 </w:t>
+      </w:r>
+      <w:r>
+        <w:rPr>
+          <w:rFonts w:ascii="Verdana" w:hAnsi="Verdana"/>
+          <w:sz w:val="22"/>
+          <w:szCs w:val="22"/>
+        </w:rPr>
+        <w:t>cytokines but interested in 4?</w:t>
+      </w:r>
+    </w:p>
+    <w:p>
+      <w:pPr>
+        <w:pStyle w:val="ListParagraph"/>
+        <w:numPr>
+          <w:ilvl w:val="0"/>
+          <w:numId w:val="4"/>
+        </w:numPr>
+        <w:rPr>
+          <w:rFonts w:ascii="Verdana" w:hAnsi="Verdana"/>
+          <w:sz w:val="22"/>
+          <w:szCs w:val="22"/>
+        </w:rPr>
+      </w:pPr>
+      <w:r>
+        <w:rPr>
+          <w:rFonts w:ascii="Verdana" w:hAnsi="Verdana"/>
+          <w:b/>
+          <w:bCs/>
+          <w:sz w:val="22"/>
+          <w:szCs w:val="22"/>
+        </w:rPr>
+        <w:t>Is there a preferred way to summarize across cytokines</w:t>
+      </w:r>
+      <w:r>
+        <w:rPr>
+          <w:rFonts w:ascii="Verdana" w:hAnsi="Verdana"/>
+          <w:sz w:val="22"/>
+          <w:szCs w:val="22"/>
+        </w:rPr>
+        <w:t xml:space="preserve"> — individual markers only, a composite/index, or both? </w:t>
+      </w:r>
+    </w:p>
+    <w:p>
+      <w:pPr>
+        <w:pStyle w:val="ListParagraph"/>
+        <w:numPr>
+          <w:ilvl w:val="0"/>
+          <w:numId w:val="4"/>
+        </w:numPr>
+        <w:rPr>
+          <w:rFonts w:ascii="Verdana" w:hAnsi="Verdana"/>
+          <w:sz w:val="22"/>
+          <w:szCs w:val="22"/>
+        </w:rPr>
+      </w:pPr>
+      <w:r>
+        <w:rPr>
+          <w:rFonts w:ascii="Verdana" w:hAnsi="Verdana"/>
+          <w:b/>
+          <w:bCs/>
+          <w:sz w:val="22"/>
+          <w:szCs w:val="22"/>
+        </w:rPr>
+        <w:t>Is there any pilot data available</w:t>
+      </w:r>
+      <w:r>
+        <w:rPr>
+          <w:rFonts w:ascii="Verdana" w:hAnsi="Verdana"/>
+          <w:sz w:val="22"/>
+          <w:szCs w:val="22"/>
+        </w:rPr>
+        <w:t xml:space="preserve"> (means, SDs, correlations between inflammation markers and cognitive outcomes), or should effect sizes be drawn entirely from published literature? If the latter, are there specific papers you'd want referenced? </w:t>
+      </w:r>
+    </w:p>
+    <w:p>
+      <w:pPr>
+        <w:pStyle w:val="ListParagraph"/>
+        <w:numPr>
+          <w:ilvl w:val="0"/>
+          <w:numId w:val="4"/>
+        </w:numPr>
+        <w:rPr>
+          <w:rFonts w:ascii="Verdana" w:hAnsi="Verdana"/>
+          <w:sz w:val="22"/>
+          <w:szCs w:val="22"/>
+        </w:rPr>
+      </w:pPr>
+      <w:r>
+        <w:rPr>
+          <w:rFonts w:ascii="Verdana" w:hAnsi="Verdana"/>
+          <w:b/>
+          <w:bCs/>
+          <w:sz w:val="22"/>
+          <w:szCs w:val="22"/>
+        </w:rPr>
+        <w:t>How is amyloid measured in this study?</w:t>
+      </w:r>
+      <w:r>
+        <w:rPr>
+          <w:rFonts w:ascii="Verdana" w:hAnsi="Verdana"/>
+          <w:sz w:val="22"/>
+          <w:szCs w:val="22"/>
+        </w:rPr>
+        <w:t xml:space="preserve"> Continuous PET SUVR, binary amyloid+/-, CSF, or a combination? If binary, what is the established cutoff being used? </w:t>
+      </w:r>
+    </w:p>
+    <w:p>
+      <w:pPr>
+        <w:pStyle w:val="ListParagraph"/>
+        <w:numPr>
+          <w:ilvl w:val="1"/>
+          <w:numId w:val="4"/>
+        </w:numPr>
+        <w:rPr>
+          <w:rFonts w:ascii="Verdana" w:hAnsi="Verdana"/>
+          <w:sz w:val="22"/>
+          <w:szCs w:val="22"/>
+        </w:rPr>
+      </w:pPr>
+      <w:r>
+        <w:rPr>
+          <w:rFonts w:ascii="Verdana" w:hAnsi="Verdana"/>
+          <w:sz w:val="22"/>
+          <w:szCs w:val="22"/>
+        </w:rPr>
+        <w:t xml:space="preserve">Think that the more amyloid deposition the more the memory </w:t>
+      </w:r>
+    </w:p>
+    <w:p>
+      <w:pPr>
+        <w:pStyle w:val="ListParagraph"/>
+        <w:numPr>
+          <w:ilvl w:val="1"/>
+          <w:numId w:val="4"/>
+        </w:numPr>
+        <w:rPr>
+          <w:rFonts w:ascii="Verdana" w:hAnsi="Verdana"/>
+          <w:sz w:val="22"/>
+          <w:szCs w:val="22"/>
+        </w:rPr>
+      </w:pPr>
+      <w:r>
+        <w:rPr>
+          <w:rFonts w:ascii="Verdana" w:hAnsi="Verdana"/>
+          <w:sz w:val="22"/>
+          <w:szCs w:val="22"/>
+        </w:rPr>
+        <w:t>Continuous measurement</w:t>
+      </w:r>
+      <w:r>
+        <w:rPr>
+          <w:rFonts w:ascii="Verdana" w:hAnsi="Verdana"/>
+          <w:sz w:val="22"/>
+          <w:szCs w:val="22"/>
+        </w:rPr>
+        <w:t xml:space="preserve"> – it’s its own variable</w:t>
+      </w:r>
+    </w:p>
+    <w:p>
+      <w:pPr>
+        <w:pStyle w:val="ListParagraph"/>
+        <w:numPr>
+          <w:ilvl w:val="1"/>
+          <w:numId w:val="4"/>
+        </w:numPr>
+        <w:rPr>
+          <w:rFonts w:ascii="Verdana" w:hAnsi="Verdana"/>
+          <w:sz w:val="22"/>
+          <w:szCs w:val="22"/>
+        </w:rPr>
+      </w:pPr>
+      <w:r>
+        <w:rPr>
+          <w:rFonts w:ascii="Verdana" w:hAnsi="Verdana"/>
+          <w:sz w:val="22"/>
+          <w:szCs w:val="22"/>
+        </w:rPr>
+        <w:t>Think that there is more</w:t>
+      </w:r>
+      <w:r>
+        <w:rPr>
+          <w:rFonts w:ascii="Verdana" w:hAnsi="Verdana"/>
+          <w:sz w:val="22"/>
+          <w:szCs w:val="22"/>
+        </w:rPr>
+        <w:t xml:space="preserve"> inflammation and more amyloid have a </w:t>
+      </w:r>
+      <w:r>
+        <w:rPr>
+          <w:rFonts w:ascii="Verdana" w:hAnsi="Verdana"/>
+          <w:sz w:val="22"/>
+          <w:szCs w:val="22"/>
+        </w:rPr>
+        <w:t>greater decline, worst case scenario for someone</w:t>
+      </w:r>
+    </w:p>
+    <w:p>
+      <w:pPr>
+        <w:pStyle w:val="ListParagraph"/>
+        <w:numPr>
+          <w:ilvl w:val="0"/>
+          <w:numId w:val="4"/>
+        </w:numPr>
+        <w:rPr>
+          <w:rFonts w:ascii="Verdana" w:hAnsi="Verdana"/>
+          <w:sz w:val="22"/>
+          <w:szCs w:val="22"/>
+        </w:rPr>
+      </w:pPr>
+      <w:r>
+        <w:rPr>
+          <w:rFonts w:ascii="Verdana" w:hAnsi="Verdana"/>
+          <w:b/>
+          <w:bCs/>
+          <w:sz w:val="22"/>
+          <w:szCs w:val="22"/>
+        </w:rPr>
+        <w:t>For the cardiovascular/immune covariates</w:t>
+      </w:r>
+      <w:r>
+        <w:rPr>
+          <w:rFonts w:ascii="Verdana" w:hAnsi="Verdana"/>
+          <w:sz w:val="22"/>
+          <w:szCs w:val="22"/>
+        </w:rPr>
+        <w:t xml:space="preserve"> (BMI, hypercholesterolemia, NSAID use, immune conditions) — do you have a preferred way to handle these, or should the plan determine that empirically via collinearity checks?</w:t>
+      </w:r>
+    </w:p>
+    <w:p>
+      <w:pPr>
+        <w:pStyle w:val="ListParagraph"/>
+        <w:numPr>
+          <w:ilvl w:val="0"/>
+          <w:numId w:val="4"/>
+        </w:numPr>
+        <w:rPr>
+          <w:rFonts w:ascii="Verdana" w:hAnsi="Verdana"/>
+          <w:sz w:val="22"/>
+          <w:szCs w:val="22"/>
+        </w:rPr>
+      </w:pPr>
+      <w:r>
+        <w:rPr>
+          <w:rFonts w:ascii="Verdana" w:hAnsi="Verdana"/>
+          <w:sz w:val="22"/>
+          <w:szCs w:val="22"/>
+        </w:rPr>
+        <w:t>Only looking at the one year change not a longitudinal model</w:t>
+      </w:r>
+    </w:p>
+    <w:p>
+      <w:pPr>
+        <w:pStyle w:val="ListParagraph"/>
+        <w:numPr>
+          <w:ilvl w:val="0"/>
+          <w:numId w:val="4"/>
+        </w:numPr>
+        <w:rPr>
+          <w:rFonts w:ascii="Verdana" w:hAnsi="Verdana"/>
+          <w:sz w:val="22"/>
+          <w:szCs w:val="22"/>
+        </w:rPr>
+      </w:pPr>
+      <w:r>
+        <w:rPr>
+          <w:rFonts w:ascii="Verdana" w:hAnsi="Verdana"/>
+          <w:sz w:val="22"/>
+          <w:szCs w:val="22"/>
+        </w:rPr>
+        <w:t xml:space="preserve">Max number of patients </w:t>
+      </w:r>
+      <w:r>
+        <w:rPr>
+          <w:rFonts w:ascii="Verdana" w:hAnsi="Verdana"/>
+          <w:sz w:val="22"/>
+          <w:szCs w:val="22"/>
+        </w:rPr>
+        <w:t>in report</w:t>
+      </w:r>
+    </w:p>
+    <w:p>
+      <w:pPr>
+        <w:pStyle w:val="ListParagraph"/>
+        <w:numPr>
+          <w:ilvl w:val="0"/>
+          <w:numId w:val="4"/>
+        </w:numPr>
+        <w:rPr>
+          <w:rFonts w:ascii="Verdana" w:hAnsi="Verdana"/>
+          <w:sz w:val="22"/>
+          <w:szCs w:val="22"/>
+        </w:rPr>
+      </w:pPr>
+      <w:r>
+        <w:rPr>
+          <w:rFonts w:ascii="Verdana" w:hAnsi="Verdana"/>
+          <w:sz w:val="22"/>
+          <w:szCs w:val="22"/>
+        </w:rPr>
+        <w:t>Recommendations for covariates, need to add</w:t>
+      </w:r>
+    </w:p>
+    <w:p>
+      <w:pPr>
+        <w:rPr>
+          <w:rFonts w:ascii="Verdana" w:hAnsi="Verdana"/>
+          <w:sz w:val="22"/>
+          <w:szCs w:val="22"/>
+        </w:rPr>
+      </w:pPr>
+      <w:r>
+        <w:rPr>
+          <w:rFonts w:ascii="Verdana" w:hAnsi="Verdana"/>
+          <w:sz w:val="22"/>
+          <w:szCs w:val="22"/>
+        </w:rPr>
+        <w:t>Primary is baseline change to follow up</w:t>
+      </w:r>
+      <w:r>
+        <w:rPr>
+          <w:rFonts w:ascii="Verdana" w:hAnsi="Verdana"/>
+          <w:sz w:val="22"/>
+          <w:szCs w:val="22"/>
+        </w:rPr>
+        <w:t xml:space="preserve"> for aim 1b: interested in changes</w:t>
+      </w:r>
+    </w:p>
+    <w:p>
+      <w:pPr>
+        <w:pStyle w:val="ListParagraph"/>
         <w:numPr>
           <w:ilvl w:val="0"/>
           <w:numId w:val="3"/>
         </w:numPr>
-        <w:shd w:val="clear" w:color="auto" w:fill="FFFFFF"/>
-        <w:spacing w:before="180" w:beforeAutospacing="0" w:after="180" w:afterAutospacing="0"/>
-        <w:rPr>
-          <w:rFonts w:asciiTheme="minorHAnsi" w:hAnsiTheme="minorHAnsi"/>
-          <w:color w:val="273540"/>
-          <w:sz w:val="22"/>
-          <w:szCs w:val="22"/>
-        </w:rPr>
-      </w:pPr>
-      <w:r>
-        <w:rPr>
-          <w:rFonts w:ascii="Arial" w:eastAsia="Arial" w:hAnsi="Arial" w:cs="Arial"/>
-          <w:sz w:val="20"/>
-          <w:szCs w:val="20"/>
-        </w:rPr>
-        <w:t>Aim 1 will be conducted in R for multiple linear regression, evaluating the ability to detect the contribution of cytokine/chemokine predictors over and above covariates. Calculations will be based on the projected final analytic sample of 175 participants (125 aMCI + 50 HC combined, after ~10% attrition from 192 enrolled)</w:t>
+        <w:rPr>
+          <w:rFonts w:ascii="Verdana" w:hAnsi="Verdana"/>
+          <w:sz w:val="22"/>
+          <w:szCs w:val="22"/>
+        </w:rPr>
+      </w:pPr>
+      <w:r>
+        <w:rPr>
+          <w:rFonts w:ascii="Verdana" w:hAnsi="Verdana"/>
+          <w:sz w:val="22"/>
+          <w:szCs w:val="22"/>
+        </w:rPr>
+        <w:t>If we aren’t seeing any change in 1, less likely to think it impacts hypothesis 2</w:t>
+      </w:r>
+    </w:p>
+    <w:p>
+      <w:pPr>
+        <w:rPr>
+          <w:rFonts w:ascii="Verdana" w:hAnsi="Verdana"/>
+          <w:sz w:val="22"/>
+          <w:szCs w:val="22"/>
+        </w:rPr>
+      </w:pPr>
+      <w:r>
+        <w:rPr>
+          <w:rFonts w:ascii="Verdana" w:hAnsi="Verdana"/>
+          <w:sz w:val="22"/>
+          <w:szCs w:val="22"/>
+        </w:rPr>
+        <w:t xml:space="preserve">For interim , </w:t>
       </w:r>
     </w:p>
     <w:p>
@@ -652,85 +1377,41 @@
           <w:ilvl w:val="0"/>
           <w:numId w:val="3"/>
         </w:numPr>
-        <w:spacing w:after="120"/>
-      </w:pPr>
-      <w:r>
-        <w:rPr>
-          <w:rFonts w:ascii="Arial" w:eastAsia="Arial" w:hAnsi="Arial" w:cs="Arial"/>
-          <w:sz w:val="20"/>
-          <w:szCs w:val="20"/>
-        </w:rPr>
-        <w:t>Aim 2 will be conducted in R for the detection of a statistically significant interaction term in multiple linear regression. Interaction effects are typically smaller than main effects; accordingly, literature-based estimates of interaction effect sizes in comparable inflammation x amyloid studies will be used, and sensitivity analyses across a range of plausible effect sizes will be reported. The same projected analytic sample of 175 participants applies. Power will be reported for each outcome (memory and cortical thickness) separately.</w:t>
-      </w:r>
-    </w:p>
-    <w:p>
-      <w:pPr>
-        <w:pStyle w:val="NormalWeb"/>
+        <w:rPr>
+          <w:rFonts w:ascii="Verdana" w:hAnsi="Verdana"/>
+          <w:sz w:val="22"/>
+          <w:szCs w:val="22"/>
+        </w:rPr>
+      </w:pPr>
+      <w:r>
+        <w:rPr>
+          <w:rFonts w:ascii="Verdana" w:hAnsi="Verdana"/>
+          <w:sz w:val="22"/>
+          <w:szCs w:val="22"/>
+        </w:rPr>
+        <w:t>know hypothesis</w:t>
+      </w:r>
+    </w:p>
+    <w:p>
+      <w:pPr>
+        <w:pStyle w:val="ListParagraph"/>
         <w:numPr>
           <w:ilvl w:val="0"/>
           <w:numId w:val="3"/>
         </w:numPr>
-        <w:shd w:val="clear" w:color="auto" w:fill="FFFFFF"/>
-        <w:spacing w:before="180" w:beforeAutospacing="0" w:after="180" w:afterAutospacing="0"/>
-        <w:rPr>
-          <w:rFonts w:asciiTheme="minorHAnsi" w:hAnsiTheme="minorHAnsi"/>
-          <w:color w:val="273540"/>
-          <w:sz w:val="22"/>
-          <w:szCs w:val="22"/>
-        </w:rPr>
-      </w:pPr>
-    </w:p>
-    <w:p>
-      <w:pPr>
-        <w:pStyle w:val="NormalWeb"/>
-        <w:shd w:val="clear" w:color="auto" w:fill="FFFFFF"/>
-        <w:spacing w:before="180" w:beforeAutospacing="0" w:after="180" w:afterAutospacing="0"/>
-        <w:rPr>
-          <w:rFonts w:asciiTheme="minorHAnsi" w:hAnsiTheme="minorHAnsi"/>
-          <w:color w:val="273540"/>
-          <w:sz w:val="22"/>
-          <w:szCs w:val="22"/>
-        </w:rPr>
-      </w:pPr>
-      <w:r>
-        <w:rPr>
-          <w:rFonts w:asciiTheme="minorHAnsi" w:hAnsiTheme="minorHAnsi"/>
-          <w:color w:val="273540"/>
-          <w:sz w:val="22"/>
-          <w:szCs w:val="22"/>
-        </w:rPr>
-        <w:t>5. Not required for interim, but will be required for final: thoughts on your approach to type I error control.</w:t>
-      </w:r>
-    </w:p>
-    <w:p>
-      <w:pPr>
-        <w:rPr>
-          <w:sz w:val="22"/>
-          <w:szCs w:val="22"/>
-        </w:rPr>
-      </w:pPr>
-    </w:p>
-    <w:p>
-      <w:pPr>
-        <w:rPr>
-          <w:sz w:val="22"/>
-          <w:szCs w:val="22"/>
-        </w:rPr>
-      </w:pPr>
-    </w:p>
-    <w:p>
-      <w:pPr>
-        <w:rPr>
-          <w:sz w:val="22"/>
-          <w:szCs w:val="22"/>
-        </w:rPr>
-      </w:pPr>
-      <w:r>
-        <w:rPr>
-          <w:sz w:val="22"/>
-          <w:szCs w:val="22"/>
-        </w:rPr>
-        <w:t>PI Questions:</w:t>
+        <w:rPr>
+          <w:rFonts w:ascii="Verdana" w:hAnsi="Verdana"/>
+          <w:sz w:val="22"/>
+          <w:szCs w:val="22"/>
+        </w:rPr>
+      </w:pPr>
+      <w:r>
+        <w:rPr>
+          <w:rFonts w:ascii="Verdana" w:hAnsi="Verdana"/>
+          <w:sz w:val="22"/>
+          <w:szCs w:val="22"/>
+        </w:rPr>
+        <w:t>know analysis plan</w:t>
       </w:r>
     </w:p>
     <w:p>
@@ -738,174 +1419,37 @@
         <w:pStyle w:val="ListParagraph"/>
         <w:numPr>
           <w:ilvl w:val="0"/>
-          <w:numId w:val="4"/>
-        </w:numPr>
-        <w:rPr>
-          <w:sz w:val="22"/>
-          <w:szCs w:val="22"/>
-        </w:rPr>
-      </w:pPr>
-      <w:r>
-        <w:rPr>
-          <w:b/>
-          <w:bCs/>
-          <w:sz w:val="22"/>
-          <w:szCs w:val="22"/>
-        </w:rPr>
-        <w:t xml:space="preserve"> How is episodic memory measured?</w:t>
-      </w:r>
-      <w:r>
-        <w:rPr>
-          <w:sz w:val="22"/>
-          <w:szCs w:val="22"/>
-        </w:rPr>
-        <w:t xml:space="preserve"> A single test score, a composite of multiple tests, or something else? Is change simply follow-up minus baseline, or is reliable change index used? </w:t>
-      </w:r>
-    </w:p>
-    <w:p>
-      <w:pPr>
-        <w:pStyle w:val="ListParagraph"/>
-        <w:numPr>
-          <w:ilvl w:val="0"/>
-          <w:numId w:val="4"/>
-        </w:numPr>
-        <w:rPr>
-          <w:sz w:val="22"/>
-          <w:szCs w:val="22"/>
-        </w:rPr>
-      </w:pPr>
-      <w:r>
-        <w:rPr>
-          <w:b/>
-          <w:bCs/>
-          <w:sz w:val="22"/>
-          <w:szCs w:val="22"/>
-        </w:rPr>
-        <w:t>How many cytokines/chemokines are being measured, and what are they?</w:t>
-      </w:r>
-      <w:r>
-        <w:rPr>
-          <w:sz w:val="22"/>
-          <w:szCs w:val="22"/>
-        </w:rPr>
-        <w:t xml:space="preserve"> The exact number directly determines how stringent the FDR correction needs to be and drives the power calculations. </w:t>
-      </w:r>
-    </w:p>
-    <w:p>
-      <w:pPr>
-        <w:pStyle w:val="ListParagraph"/>
-        <w:numPr>
-          <w:ilvl w:val="0"/>
-          <w:numId w:val="4"/>
-        </w:numPr>
-        <w:rPr>
-          <w:sz w:val="22"/>
-          <w:szCs w:val="22"/>
-        </w:rPr>
-      </w:pPr>
-      <w:r>
-        <w:rPr>
-          <w:b/>
-          <w:bCs/>
-          <w:sz w:val="22"/>
-          <w:szCs w:val="22"/>
-        </w:rPr>
-        <w:lastRenderedPageBreak/>
-        <w:t>Is there a preferred way to summarize across cytokines</w:t>
-      </w:r>
-      <w:r>
-        <w:rPr>
-          <w:sz w:val="22"/>
-          <w:szCs w:val="22"/>
-        </w:rPr>
-        <w:t xml:space="preserve"> — individual markers only, a composite/index, or both? </w:t>
-      </w:r>
-    </w:p>
-    <w:p>
-      <w:pPr>
-        <w:pStyle w:val="ListParagraph"/>
-        <w:numPr>
-          <w:ilvl w:val="0"/>
-          <w:numId w:val="4"/>
-        </w:numPr>
-        <w:rPr>
-          <w:sz w:val="22"/>
-          <w:szCs w:val="22"/>
-        </w:rPr>
-      </w:pPr>
-      <w:r>
-        <w:rPr>
-          <w:b/>
-          <w:bCs/>
-          <w:sz w:val="22"/>
-          <w:szCs w:val="22"/>
-        </w:rPr>
-        <w:t>Is there any pilot data available</w:t>
-      </w:r>
-      <w:r>
-        <w:rPr>
-          <w:sz w:val="22"/>
-          <w:szCs w:val="22"/>
-        </w:rPr>
-        <w:t xml:space="preserve"> (means, SDs, correlations between inflammation markers and cognitive outcomes), or should effect sizes be drawn entirely from published literature? If the latter, are there specific papers you'd want referenced? </w:t>
-      </w:r>
-    </w:p>
-    <w:p>
-      <w:pPr>
-        <w:pStyle w:val="ListParagraph"/>
-        <w:numPr>
-          <w:ilvl w:val="0"/>
-          <w:numId w:val="4"/>
-        </w:numPr>
-        <w:rPr>
-          <w:sz w:val="22"/>
-          <w:szCs w:val="22"/>
-        </w:rPr>
-      </w:pPr>
-      <w:r>
-        <w:rPr>
-          <w:b/>
-          <w:bCs/>
-          <w:sz w:val="22"/>
-          <w:szCs w:val="22"/>
-        </w:rPr>
-        <w:t>How is amyloid measured in this study?</w:t>
-      </w:r>
-      <w:r>
-        <w:rPr>
-          <w:sz w:val="22"/>
-          <w:szCs w:val="22"/>
-        </w:rPr>
-        <w:t xml:space="preserve"> Continuous PET SUVR, binary amyloid+/-, CSF, or a combination? If binary, what is the established cutoff being used? </w:t>
-      </w:r>
-    </w:p>
-    <w:p>
-      <w:pPr>
-        <w:pStyle w:val="ListParagraph"/>
-        <w:numPr>
-          <w:ilvl w:val="0"/>
-          <w:numId w:val="4"/>
-        </w:numPr>
-        <w:rPr>
-          <w:sz w:val="22"/>
-          <w:szCs w:val="22"/>
-        </w:rPr>
-      </w:pPr>
-      <w:r>
-        <w:rPr>
-          <w:b/>
-          <w:bCs/>
-          <w:sz w:val="22"/>
-          <w:szCs w:val="22"/>
-        </w:rPr>
-        <w:t>For the cardiovascular/immune covariates</w:t>
-      </w:r>
-      <w:r>
-        <w:rPr>
-          <w:sz w:val="22"/>
-          <w:szCs w:val="22"/>
-        </w:rPr>
-        <w:t xml:space="preserve"> (BMI, hypercholesterolemia, NSAID use, immune conditions) — do you have a preferred way to handle these, or should the plan determine that empirically via collinearity checks?</w:t>
+          <w:numId w:val="3"/>
+        </w:numPr>
+        <w:rPr>
+          <w:rFonts w:ascii="Verdana" w:hAnsi="Verdana"/>
+          <w:sz w:val="22"/>
+          <w:szCs w:val="22"/>
+        </w:rPr>
+      </w:pPr>
+      <w:r>
+        <w:rPr>
+          <w:rFonts w:ascii="Verdana" w:hAnsi="Verdana"/>
+          <w:sz w:val="22"/>
+          <w:szCs w:val="22"/>
+        </w:rPr>
+        <w:t>i</w:t>
+      </w:r>
+      <w:r>
+        <w:rPr>
+          <w:rFonts w:ascii="Verdana" w:hAnsi="Verdana"/>
+          <w:sz w:val="22"/>
+          <w:szCs w:val="22"/>
+        </w:rPr>
+        <w:t>deas for what to do for power</w:t>
+      </w:r>
+      <w:r>
+        <w:rPr>
+          <w:rFonts w:ascii="Verdana" w:hAnsi="Verdana"/>
+          <w:sz w:val="22"/>
+          <w:szCs w:val="22"/>
+        </w:rPr>
+        <w:t xml:space="preserve"> not the actual calculation</w:t>
       </w:r>
     </w:p>
     <w:sectPr>
@@ -936,7 +1480,7 @@
         <w:rFonts w:hint="default"/>
       </w:rPr>
     </w:lvl>
-    <w:lvl w:ilvl="1" w:tplc="04090019" w:tentative="1">
+    <w:lvl w:ilvl="1" w:tplc="04090019">
       <w:start w:val="1"/>
       <w:numFmt w:val="lowerLetter"/>
       <w:lvlText w:val="%2."/>

</xml_diff>